<commit_message>
final submission with the new byutr.h
</commit_message>
<xml_diff>
--- a/pex3_report.docx
+++ b/pex3_report.docx
@@ -4,11 +4,16 @@
   <w:body>
     <w:p>
       <w:pPr>
-        <w:spacing w:after="220" w:lineRule="auto"/>
-        <w:rPr/>
-      </w:pPr>
-      <w:r>
-        <w:rPr>
+        <w:spacing w:after="160" w:lineRule="auto"/>
+        <w:rPr>
+          <w:b w:val="1"/>
+          <w:bCs w:val="1"/>
+        </w:rPr>
+      </w:pPr>
+      <w:r>
+        <w:rPr>
+          <w:b w:val="1"/>
+          <w:bCs w:val="1"/>
           <w:rtl w:val="0"/>
         </w:rPr>
         <w:t xml:space="preserve">PEX3 Analysis Report: LRU Page Replacement Simulation</w:t>
@@ -16,16 +21,21 @@
     </w:p>
     <w:p>
       <w:pPr>
-        <w:spacing w:after="160" w:lineRule="auto"/>
-        <w:rPr/>
-      </w:pPr>
-      <w:r>
-        <w:rPr>
+        <w:spacing w:after="120" w:lineRule="auto"/>
+        <w:rPr>
+          <w:b w:val="1"/>
+          <w:bCs w:val="1"/>
+        </w:rPr>
+      </w:pPr>
+      <w:r>
+        <w:rPr>
+          <w:b w:val="1"/>
+          <w:bCs w:val="1"/>
           <w:rtl w:val="0"/>
         </w:rPr>
         <w:t xml:space="preserve">CS 483 — Operating Systems — Spring 2026</w:t>
         <w:br w:type="textWrapping"/>
-        <w:t xml:space="preserve"> Name: mark alano     Section: m3     Date: 24 apr 2026</w:t>
+        <w:t xml:space="preserve">  Name: mark alano     Section: m3     Date: 24 apr 2026</w:t>
       </w:r>
     </w:p>
     <w:p>
@@ -46,11 +56,16 @@
     </w:p>
     <w:p>
       <w:pPr>
-        <w:spacing w:after="360" w:lineRule="auto"/>
-        <w:rPr/>
-      </w:pPr>
-      <w:r>
-        <w:rPr>
+        <w:spacing w:after="280" w:lineRule="auto"/>
+        <w:rPr>
+          <w:b w:val="1"/>
+          <w:bCs w:val="1"/>
+        </w:rPr>
+      </w:pPr>
+      <w:r>
+        <w:rPr>
+          <w:b w:val="1"/>
+          <w:bCs w:val="1"/>
           <w:rtl w:val="0"/>
         </w:rPr>
         <w:t xml:space="preserve">Citations are on site plus my Claude log</w:t>
@@ -58,23 +73,19 @@
       <w:hyperlink r:id="rId6">
         <w:r>
           <w:rPr>
-            <w:rtl w:val="0"/>
-          </w:rPr>
-          <w:t xml:space="preserve"> </w:t>
-        </w:r>
-      </w:hyperlink>
-      <w:hyperlink r:id="rId7">
-        <w:r>
-          <w:rPr>
+            <w:b w:val="1"/>
+            <w:bCs w:val="1"/>
             <w:color w:val="1155cc"/>
             <w:u w:val="single"/>
             <w:rtl w:val="0"/>
           </w:rPr>
-          <w:t xml:space="preserve">https://claude.ai/share/8d1c9cbe-3e87-484e-bf4b-20fe55826e31</w:t>
+          <w:t xml:space="preserve"> https://claude.ai/share/8d1c9cbe-3e87-484e-bf4b-20fe55826e31</w:t>
         </w:r>
       </w:hyperlink>
       <w:r>
         <w:rPr>
+          <w:b w:val="1"/>
+          <w:bCs w:val="1"/>
           <w:rtl w:val="0"/>
         </w:rPr>
         <w:t xml:space="preserve"> </w:t>
@@ -98,14 +109,19 @@
     </w:p>
     <w:p>
       <w:pPr>
-        <w:spacing w:after="360" w:lineRule="auto"/>
-        <w:rPr/>
-      </w:pPr>
-      <w:r>
-        <w:rPr>
-          <w:rtl w:val="0"/>
-        </w:rPr>
-        <w:t xml:space="preserve">4k achieves &lt; 10% at 380 frames, which is the earliest out of the 4. The next best is 2k at 685, a 55.474% later achievement. If resources are tight, go with the 2k, otherwise, 4k is the recommendation. The other two end up in the thousands, a significant jump.</w:t>
+        <w:spacing w:after="280" w:lineRule="auto"/>
+        <w:rPr>
+          <w:b w:val="1"/>
+          <w:bCs w:val="1"/>
+        </w:rPr>
+      </w:pPr>
+      <w:r>
+        <w:rPr>
+          <w:b w:val="1"/>
+          <w:bCs w:val="1"/>
+          <w:rtl w:val="0"/>
+        </w:rPr>
+        <w:t xml:space="preserve">4k achieves &lt; 10% at 106 frames, which is the earliest out of the 4. The next best is 2k at 179, a 40.782% later achievement. If resources are tight, go with the 2k, otherwise, 4k is the recommendation. The other two end up exponentially increasing, a significant jump.</w:t>
       </w:r>
     </w:p>
     <w:p>
@@ -126,20 +142,22 @@
     </w:p>
     <w:p>
       <w:pPr>
-        <w:spacing w:after="100" w:lineRule="auto"/>
-        <w:rPr/>
-      </w:pPr>
-      <w:r>
-        <w:rPr>
-          <w:rtl w:val="0"/>
-        </w:rPr>
-        <w:t xml:space="preserve">For each frame size, identify the minimum number of frames where the page-fault rate first drops below 10%.</w:t>
+        <w:spacing w:after="80" w:lineRule="auto"/>
+        <w:rPr>
+          <w:b w:val="1"/>
+          <w:bCs w:val="1"/>
+        </w:rPr>
+      </w:pPr>
+      <w:r>
+        <w:rPr>
+          <w:rtl w:val="0"/>
+        </w:rPr>
       </w:r>
     </w:p>
     <w:tbl>
       <w:tblPr>
         <w:tblStyle w:val="Table1"/>
-        <w:tblW w:w="7080.0" w:type="dxa"/>
+        <w:tblW w:w="5910.0" w:type="dxa"/>
         <w:jc w:val="left"/>
         <w:tblBorders>
           <w:top w:color="000000" w:space="0" w:sz="0" w:val="nil"/>
@@ -153,30 +171,30 @@
         <w:tblLook w:val="0600"/>
       </w:tblPr>
       <w:tblGrid>
-        <w:gridCol w:w="2360"/>
-        <w:gridCol w:w="2360"/>
-        <w:gridCol w:w="2360"/>
+        <w:gridCol w:w="1970"/>
+        <w:gridCol w:w="1970"/>
+        <w:gridCol w:w="1970"/>
         <w:tblGridChange w:id="0">
           <w:tblGrid>
-            <w:gridCol w:w="2360"/>
-            <w:gridCol w:w="2360"/>
-            <w:gridCol w:w="2360"/>
+            <w:gridCol w:w="1970"/>
+            <w:gridCol w:w="1970"/>
+            <w:gridCol w:w="1970"/>
           </w:tblGrid>
         </w:tblGridChange>
       </w:tblGrid>
       <w:tr>
         <w:trPr>
           <w:cantSplit w:val="0"/>
-          <w:trHeight w:val="620" w:hRule="atLeast"/>
+          <w:trHeight w:val="800" w:hRule="atLeast"/>
           <w:tblHeader w:val="0"/>
         </w:trPr>
         <w:tc>
           <w:tcPr>
             <w:tcBorders>
-              <w:top w:color="3f6caf" w:space="0" w:sz="6" w:val="single"/>
-              <w:left w:color="3f6caf" w:space="0" w:sz="6" w:val="single"/>
-              <w:bottom w:color="3f6caf" w:space="0" w:sz="6" w:val="single"/>
-              <w:right w:color="3f6caf" w:space="0" w:sz="6" w:val="single"/>
+              <w:top w:color="31569f" w:space="0" w:sz="6" w:val="single"/>
+              <w:left w:color="31569f" w:space="0" w:sz="6" w:val="single"/>
+              <w:bottom w:color="31569f" w:space="0" w:sz="6" w:val="single"/>
+              <w:right w:color="31569f" w:space="0" w:sz="6" w:val="single"/>
             </w:tcBorders>
             <w:tcMar>
               <w:top w:w="100.0" w:type="dxa"/>
@@ -188,7 +206,7 @@
           </w:tcPr>
           <w:p>
             <w:pPr>
-              <w:spacing w:after="100" w:lineRule="auto"/>
+              <w:spacing w:after="80" w:lineRule="auto"/>
               <w:rPr>
                 <w:b w:val="1"/>
                 <w:bCs w:val="1"/>
@@ -207,10 +225,10 @@
         <w:tc>
           <w:tcPr>
             <w:tcBorders>
-              <w:top w:color="3f6caf" w:space="0" w:sz="6" w:val="single"/>
-              <w:left w:color="3f6caf" w:space="0" w:sz="6" w:val="single"/>
-              <w:bottom w:color="3f6caf" w:space="0" w:sz="6" w:val="single"/>
-              <w:right w:color="3f6caf" w:space="0" w:sz="6" w:val="single"/>
+              <w:top w:color="31569f" w:space="0" w:sz="6" w:val="single"/>
+              <w:left w:color="31569f" w:space="0" w:sz="6" w:val="single"/>
+              <w:bottom w:color="31569f" w:space="0" w:sz="6" w:val="single"/>
+              <w:right w:color="31569f" w:space="0" w:sz="6" w:val="single"/>
             </w:tcBorders>
             <w:tcMar>
               <w:top w:w="100.0" w:type="dxa"/>
@@ -222,7 +240,7 @@
           </w:tcPr>
           <w:p>
             <w:pPr>
-              <w:spacing w:after="100" w:lineRule="auto"/>
+              <w:spacing w:after="80" w:lineRule="auto"/>
               <w:rPr>
                 <w:b w:val="1"/>
                 <w:bCs w:val="1"/>
@@ -241,10 +259,10 @@
         <w:tc>
           <w:tcPr>
             <w:tcBorders>
-              <w:top w:color="3f6caf" w:space="0" w:sz="6" w:val="single"/>
-              <w:left w:color="3f6caf" w:space="0" w:sz="6" w:val="single"/>
-              <w:bottom w:color="3f6caf" w:space="0" w:sz="6" w:val="single"/>
-              <w:right w:color="3f6caf" w:space="0" w:sz="6" w:val="single"/>
+              <w:top w:color="31569f" w:space="0" w:sz="6" w:val="single"/>
+              <w:left w:color="31569f" w:space="0" w:sz="6" w:val="single"/>
+              <w:bottom w:color="31569f" w:space="0" w:sz="6" w:val="single"/>
+              <w:right w:color="31569f" w:space="0" w:sz="6" w:val="single"/>
             </w:tcBorders>
             <w:tcMar>
               <w:top w:w="100.0" w:type="dxa"/>
@@ -256,7 +274,7 @@
           </w:tcPr>
           <w:p>
             <w:pPr>
-              <w:spacing w:after="100" w:lineRule="auto"/>
+              <w:spacing w:after="80" w:lineRule="auto"/>
               <w:rPr>
                 <w:b w:val="1"/>
                 <w:bCs w:val="1"/>
@@ -276,16 +294,16 @@
       <w:tr>
         <w:trPr>
           <w:cantSplit w:val="0"/>
-          <w:trHeight w:val="620" w:hRule="atLeast"/>
+          <w:trHeight w:val="695" w:hRule="atLeast"/>
           <w:tblHeader w:val="0"/>
         </w:trPr>
         <w:tc>
           <w:tcPr>
             <w:tcBorders>
-              <w:top w:color="3f6caf" w:space="0" w:sz="6" w:val="single"/>
-              <w:left w:color="3f6caf" w:space="0" w:sz="6" w:val="single"/>
-              <w:bottom w:color="3f6caf" w:space="0" w:sz="6" w:val="single"/>
-              <w:right w:color="3f6caf" w:space="0" w:sz="6" w:val="single"/>
+              <w:top w:color="31569f" w:space="0" w:sz="6" w:val="single"/>
+              <w:left w:color="31569f" w:space="0" w:sz="6" w:val="single"/>
+              <w:bottom w:color="31569f" w:space="0" w:sz="6" w:val="single"/>
+              <w:right w:color="31569f" w:space="0" w:sz="6" w:val="single"/>
             </w:tcBorders>
             <w:tcMar>
               <w:top w:w="100.0" w:type="dxa"/>
@@ -297,7 +315,7 @@
           </w:tcPr>
           <w:p>
             <w:pPr>
-              <w:spacing w:after="100" w:lineRule="auto"/>
+              <w:spacing w:after="80" w:lineRule="auto"/>
               <w:rPr>
                 <w:b w:val="1"/>
                 <w:bCs w:val="1"/>
@@ -316,10 +334,10 @@
         <w:tc>
           <w:tcPr>
             <w:tcBorders>
-              <w:top w:color="3f6caf" w:space="0" w:sz="6" w:val="single"/>
-              <w:left w:color="3f6caf" w:space="0" w:sz="6" w:val="single"/>
-              <w:bottom w:color="3f6caf" w:space="0" w:sz="6" w:val="single"/>
-              <w:right w:color="3f6caf" w:space="0" w:sz="6" w:val="single"/>
+              <w:top w:color="31569f" w:space="0" w:sz="6" w:val="single"/>
+              <w:left w:color="31569f" w:space="0" w:sz="6" w:val="single"/>
+              <w:bottom w:color="31569f" w:space="0" w:sz="6" w:val="single"/>
+              <w:right w:color="31569f" w:space="0" w:sz="6" w:val="single"/>
             </w:tcBorders>
             <w:tcMar>
               <w:top w:w="100.0" w:type="dxa"/>
@@ -331,24 +349,29 @@
           </w:tcPr>
           <w:p>
             <w:pPr>
-              <w:spacing w:after="100" w:lineRule="auto"/>
-              <w:rPr/>
+              <w:spacing w:after="80" w:lineRule="auto"/>
+              <w:rPr>
+                <w:b w:val="1"/>
+                <w:bCs w:val="1"/>
+              </w:rPr>
             </w:pPr>
             <w:r>
               <w:rPr>
+                <w:b w:val="1"/>
+                <w:bCs w:val="1"/>
                 <w:rtl w:val="0"/>
               </w:rPr>
-              <w:t xml:space="preserve">2974</w:t>
+              <w:t xml:space="preserve">689</w:t>
             </w:r>
           </w:p>
         </w:tc>
         <w:tc>
           <w:tcPr>
             <w:tcBorders>
-              <w:top w:color="3f6caf" w:space="0" w:sz="6" w:val="single"/>
-              <w:left w:color="3f6caf" w:space="0" w:sz="6" w:val="single"/>
-              <w:bottom w:color="3f6caf" w:space="0" w:sz="6" w:val="single"/>
-              <w:right w:color="3f6caf" w:space="0" w:sz="6" w:val="single"/>
+              <w:top w:color="31569f" w:space="0" w:sz="6" w:val="single"/>
+              <w:left w:color="31569f" w:space="0" w:sz="6" w:val="single"/>
+              <w:bottom w:color="31569f" w:space="0" w:sz="6" w:val="single"/>
+              <w:right w:color="31569f" w:space="0" w:sz="6" w:val="single"/>
             </w:tcBorders>
             <w:tcMar>
               <w:top w:w="100.0" w:type="dxa"/>
@@ -360,13 +383,18 @@
           </w:tcPr>
           <w:p>
             <w:pPr>
-              <w:rPr/>
+              <w:rPr>
+                <w:b w:val="1"/>
+                <w:bCs w:val="1"/>
+              </w:rPr>
             </w:pPr>
             <w:r>
               <w:rPr>
+                <w:b w:val="1"/>
+                <w:bCs w:val="1"/>
                 <w:rtl w:val="0"/>
               </w:rPr>
-              <w:t xml:space="preserve">0.09999</w:t>
+              <w:t xml:space="preserve">0.09996</w:t>
             </w:r>
           </w:p>
         </w:tc>
@@ -374,16 +402,16 @@
       <w:tr>
         <w:trPr>
           <w:cantSplit w:val="0"/>
-          <w:trHeight w:val="620" w:hRule="atLeast"/>
+          <w:trHeight w:val="680" w:hRule="atLeast"/>
           <w:tblHeader w:val="0"/>
         </w:trPr>
         <w:tc>
           <w:tcPr>
             <w:tcBorders>
-              <w:top w:color="3f6caf" w:space="0" w:sz="6" w:val="single"/>
-              <w:left w:color="3f6caf" w:space="0" w:sz="6" w:val="single"/>
-              <w:bottom w:color="3f6caf" w:space="0" w:sz="6" w:val="single"/>
-              <w:right w:color="3f6caf" w:space="0" w:sz="6" w:val="single"/>
+              <w:top w:color="31569f" w:space="0" w:sz="6" w:val="single"/>
+              <w:left w:color="31569f" w:space="0" w:sz="6" w:val="single"/>
+              <w:bottom w:color="31569f" w:space="0" w:sz="6" w:val="single"/>
+              <w:right w:color="31569f" w:space="0" w:sz="6" w:val="single"/>
             </w:tcBorders>
             <w:tcMar>
               <w:top w:w="100.0" w:type="dxa"/>
@@ -395,7 +423,7 @@
           </w:tcPr>
           <w:p>
             <w:pPr>
-              <w:spacing w:after="100" w:lineRule="auto"/>
+              <w:spacing w:after="80" w:lineRule="auto"/>
               <w:rPr>
                 <w:b w:val="1"/>
                 <w:bCs w:val="1"/>
@@ -414,10 +442,10 @@
         <w:tc>
           <w:tcPr>
             <w:tcBorders>
-              <w:top w:color="3f6caf" w:space="0" w:sz="6" w:val="single"/>
-              <w:left w:color="3f6caf" w:space="0" w:sz="6" w:val="single"/>
-              <w:bottom w:color="3f6caf" w:space="0" w:sz="6" w:val="single"/>
-              <w:right w:color="3f6caf" w:space="0" w:sz="6" w:val="single"/>
+              <w:top w:color="31569f" w:space="0" w:sz="6" w:val="single"/>
+              <w:left w:color="31569f" w:space="0" w:sz="6" w:val="single"/>
+              <w:bottom w:color="31569f" w:space="0" w:sz="6" w:val="single"/>
+              <w:right w:color="31569f" w:space="0" w:sz="6" w:val="single"/>
             </w:tcBorders>
             <w:tcMar>
               <w:top w:w="100.0" w:type="dxa"/>
@@ -429,24 +457,29 @@
           </w:tcPr>
           <w:p>
             <w:pPr>
-              <w:spacing w:after="100" w:lineRule="auto"/>
-              <w:rPr/>
+              <w:spacing w:after="80" w:lineRule="auto"/>
+              <w:rPr>
+                <w:b w:val="1"/>
+                <w:bCs w:val="1"/>
+              </w:rPr>
             </w:pPr>
             <w:r>
               <w:rPr>
+                <w:b w:val="1"/>
+                <w:bCs w:val="1"/>
                 <w:rtl w:val="0"/>
               </w:rPr>
-              <w:t xml:space="preserve">1319</w:t>
+              <w:t xml:space="preserve">318</w:t>
             </w:r>
           </w:p>
         </w:tc>
         <w:tc>
           <w:tcPr>
             <w:tcBorders>
-              <w:top w:color="3f6caf" w:space="0" w:sz="6" w:val="single"/>
-              <w:left w:color="3f6caf" w:space="0" w:sz="6" w:val="single"/>
-              <w:bottom w:color="3f6caf" w:space="0" w:sz="6" w:val="single"/>
-              <w:right w:color="3f6caf" w:space="0" w:sz="6" w:val="single"/>
+              <w:top w:color="31569f" w:space="0" w:sz="6" w:val="single"/>
+              <w:left w:color="31569f" w:space="0" w:sz="6" w:val="single"/>
+              <w:bottom w:color="31569f" w:space="0" w:sz="6" w:val="single"/>
+              <w:right w:color="31569f" w:space="0" w:sz="6" w:val="single"/>
             </w:tcBorders>
             <w:tcMar>
               <w:top w:w="100.0" w:type="dxa"/>
@@ -458,13 +491,18 @@
           </w:tcPr>
           <w:p>
             <w:pPr>
-              <w:rPr/>
+              <w:rPr>
+                <w:b w:val="1"/>
+                <w:bCs w:val="1"/>
+              </w:rPr>
             </w:pPr>
             <w:r>
               <w:rPr>
+                <w:b w:val="1"/>
+                <w:bCs w:val="1"/>
                 <w:rtl w:val="0"/>
               </w:rPr>
-              <w:t xml:space="preserve">0.099995</w:t>
+              <w:t xml:space="preserve">0.099937</w:t>
             </w:r>
           </w:p>
         </w:tc>
@@ -472,16 +510,16 @@
       <w:tr>
         <w:trPr>
           <w:cantSplit w:val="0"/>
-          <w:trHeight w:val="620" w:hRule="atLeast"/>
+          <w:trHeight w:val="695" w:hRule="atLeast"/>
           <w:tblHeader w:val="0"/>
         </w:trPr>
         <w:tc>
           <w:tcPr>
             <w:tcBorders>
-              <w:top w:color="3f6caf" w:space="0" w:sz="6" w:val="single"/>
-              <w:left w:color="3f6caf" w:space="0" w:sz="6" w:val="single"/>
-              <w:bottom w:color="3f6caf" w:space="0" w:sz="6" w:val="single"/>
-              <w:right w:color="3f6caf" w:space="0" w:sz="6" w:val="single"/>
+              <w:top w:color="31569f" w:space="0" w:sz="6" w:val="single"/>
+              <w:left w:color="31569f" w:space="0" w:sz="6" w:val="single"/>
+              <w:bottom w:color="31569f" w:space="0" w:sz="6" w:val="single"/>
+              <w:right w:color="31569f" w:space="0" w:sz="6" w:val="single"/>
             </w:tcBorders>
             <w:tcMar>
               <w:top w:w="100.0" w:type="dxa"/>
@@ -493,7 +531,7 @@
           </w:tcPr>
           <w:p>
             <w:pPr>
-              <w:spacing w:after="100" w:lineRule="auto"/>
+              <w:spacing w:after="80" w:lineRule="auto"/>
               <w:rPr>
                 <w:b w:val="1"/>
                 <w:bCs w:val="1"/>
@@ -512,10 +550,10 @@
         <w:tc>
           <w:tcPr>
             <w:tcBorders>
-              <w:top w:color="3f6caf" w:space="0" w:sz="6" w:val="single"/>
-              <w:left w:color="3f6caf" w:space="0" w:sz="6" w:val="single"/>
-              <w:bottom w:color="3f6caf" w:space="0" w:sz="6" w:val="single"/>
-              <w:right w:color="3f6caf" w:space="0" w:sz="6" w:val="single"/>
+              <w:top w:color="31569f" w:space="0" w:sz="6" w:val="single"/>
+              <w:left w:color="31569f" w:space="0" w:sz="6" w:val="single"/>
+              <w:bottom w:color="31569f" w:space="0" w:sz="6" w:val="single"/>
+              <w:right w:color="31569f" w:space="0" w:sz="6" w:val="single"/>
             </w:tcBorders>
             <w:tcMar>
               <w:top w:w="100.0" w:type="dxa"/>
@@ -527,24 +565,29 @@
           </w:tcPr>
           <w:p>
             <w:pPr>
-              <w:spacing w:after="100" w:lineRule="auto"/>
-              <w:rPr/>
+              <w:spacing w:after="80" w:lineRule="auto"/>
+              <w:rPr>
+                <w:b w:val="1"/>
+                <w:bCs w:val="1"/>
+              </w:rPr>
             </w:pPr>
             <w:r>
               <w:rPr>
+                <w:b w:val="1"/>
+                <w:bCs w:val="1"/>
                 <w:rtl w:val="0"/>
               </w:rPr>
-              <w:t xml:space="preserve">685</w:t>
+              <w:t xml:space="preserve">179</w:t>
             </w:r>
           </w:p>
         </w:tc>
         <w:tc>
           <w:tcPr>
             <w:tcBorders>
-              <w:top w:color="3f6caf" w:space="0" w:sz="6" w:val="single"/>
-              <w:left w:color="3f6caf" w:space="0" w:sz="6" w:val="single"/>
-              <w:bottom w:color="3f6caf" w:space="0" w:sz="6" w:val="single"/>
-              <w:right w:color="3f6caf" w:space="0" w:sz="6" w:val="single"/>
+              <w:top w:color="31569f" w:space="0" w:sz="6" w:val="single"/>
+              <w:left w:color="31569f" w:space="0" w:sz="6" w:val="single"/>
+              <w:bottom w:color="31569f" w:space="0" w:sz="6" w:val="single"/>
+              <w:right w:color="31569f" w:space="0" w:sz="6" w:val="single"/>
             </w:tcBorders>
             <w:tcMar>
               <w:top w:w="100.0" w:type="dxa"/>
@@ -556,13 +599,18 @@
           </w:tcPr>
           <w:p>
             <w:pPr>
-              <w:rPr/>
+              <w:rPr>
+                <w:b w:val="1"/>
+                <w:bCs w:val="1"/>
+              </w:rPr>
             </w:pPr>
             <w:r>
               <w:rPr>
+                <w:b w:val="1"/>
+                <w:bCs w:val="1"/>
                 <w:rtl w:val="0"/>
               </w:rPr>
-              <w:t xml:space="preserve">0.099946</w:t>
+              <w:t xml:space="preserve">0.099777</w:t>
             </w:r>
           </w:p>
         </w:tc>
@@ -570,16 +618,16 @@
       <w:tr>
         <w:trPr>
           <w:cantSplit w:val="0"/>
-          <w:trHeight w:val="620" w:hRule="atLeast"/>
+          <w:trHeight w:val="695" w:hRule="atLeast"/>
           <w:tblHeader w:val="0"/>
         </w:trPr>
         <w:tc>
           <w:tcPr>
             <w:tcBorders>
-              <w:top w:color="3f6caf" w:space="0" w:sz="6" w:val="single"/>
-              <w:left w:color="3f6caf" w:space="0" w:sz="6" w:val="single"/>
-              <w:bottom w:color="3f6caf" w:space="0" w:sz="6" w:val="single"/>
-              <w:right w:color="3f6caf" w:space="0" w:sz="6" w:val="single"/>
+              <w:top w:color="31569f" w:space="0" w:sz="6" w:val="single"/>
+              <w:left w:color="31569f" w:space="0" w:sz="6" w:val="single"/>
+              <w:bottom w:color="31569f" w:space="0" w:sz="6" w:val="single"/>
+              <w:right w:color="31569f" w:space="0" w:sz="6" w:val="single"/>
             </w:tcBorders>
             <w:tcMar>
               <w:top w:w="100.0" w:type="dxa"/>
@@ -591,7 +639,7 @@
           </w:tcPr>
           <w:p>
             <w:pPr>
-              <w:spacing w:after="100" w:lineRule="auto"/>
+              <w:spacing w:after="80" w:lineRule="auto"/>
               <w:rPr>
                 <w:b w:val="1"/>
                 <w:bCs w:val="1"/>
@@ -610,10 +658,10 @@
         <w:tc>
           <w:tcPr>
             <w:tcBorders>
-              <w:top w:color="3f6caf" w:space="0" w:sz="6" w:val="single"/>
-              <w:left w:color="3f6caf" w:space="0" w:sz="6" w:val="single"/>
-              <w:bottom w:color="3f6caf" w:space="0" w:sz="6" w:val="single"/>
-              <w:right w:color="3f6caf" w:space="0" w:sz="6" w:val="single"/>
+              <w:top w:color="31569f" w:space="0" w:sz="6" w:val="single"/>
+              <w:left w:color="31569f" w:space="0" w:sz="6" w:val="single"/>
+              <w:bottom w:color="31569f" w:space="0" w:sz="6" w:val="single"/>
+              <w:right w:color="31569f" w:space="0" w:sz="6" w:val="single"/>
             </w:tcBorders>
             <w:tcMar>
               <w:top w:w="100.0" w:type="dxa"/>
@@ -625,24 +673,29 @@
           </w:tcPr>
           <w:p>
             <w:pPr>
-              <w:spacing w:after="100" w:lineRule="auto"/>
-              <w:rPr/>
+              <w:spacing w:after="80" w:lineRule="auto"/>
+              <w:rPr>
+                <w:b w:val="1"/>
+                <w:bCs w:val="1"/>
+              </w:rPr>
             </w:pPr>
             <w:r>
               <w:rPr>
+                <w:b w:val="1"/>
+                <w:bCs w:val="1"/>
                 <w:rtl w:val="0"/>
               </w:rPr>
-              <w:t xml:space="preserve">380</w:t>
+              <w:t xml:space="preserve">106</w:t>
             </w:r>
           </w:p>
         </w:tc>
         <w:tc>
           <w:tcPr>
             <w:tcBorders>
-              <w:top w:color="3f6caf" w:space="0" w:sz="6" w:val="single"/>
-              <w:left w:color="3f6caf" w:space="0" w:sz="6" w:val="single"/>
-              <w:bottom w:color="3f6caf" w:space="0" w:sz="6" w:val="single"/>
-              <w:right w:color="3f6caf" w:space="0" w:sz="6" w:val="single"/>
+              <w:top w:color="31569f" w:space="0" w:sz="6" w:val="single"/>
+              <w:left w:color="31569f" w:space="0" w:sz="6" w:val="single"/>
+              <w:bottom w:color="31569f" w:space="0" w:sz="6" w:val="single"/>
+              <w:right w:color="31569f" w:space="0" w:sz="6" w:val="single"/>
             </w:tcBorders>
             <w:tcMar>
               <w:top w:w="100.0" w:type="dxa"/>
@@ -654,13 +707,18 @@
           </w:tcPr>
           <w:p>
             <w:pPr>
-              <w:rPr/>
+              <w:rPr>
+                <w:b w:val="1"/>
+                <w:bCs w:val="1"/>
+              </w:rPr>
             </w:pPr>
             <w:r>
               <w:rPr>
+                <w:b w:val="1"/>
+                <w:bCs w:val="1"/>
                 <w:rtl w:val="0"/>
               </w:rPr>
-              <w:t xml:space="preserve">0.099904</w:t>
+              <w:t xml:space="preserve">0.099938</w:t>
             </w:r>
           </w:p>
         </w:tc>
@@ -684,14 +742,16 @@
     </w:p>
     <w:p>
       <w:pPr>
-        <w:spacing w:after="160" w:lineRule="auto"/>
-        <w:rPr/>
-      </w:pPr>
-      <w:r>
-        <w:rPr>
-          <w:rtl w:val="0"/>
-        </w:rPr>
-        <w:t xml:space="preserve">Insert one chart per frame size showing Frames (x-axis) vs. Number of Page Faults (y-axis). Each chart must have a descriptive title, labeled axes with units, and clean formatting. (1.5 pts per chart)</w:t>
+        <w:spacing w:after="120" w:lineRule="auto"/>
+        <w:rPr>
+          <w:b w:val="1"/>
+          <w:bCs w:val="1"/>
+        </w:rPr>
+      </w:pPr>
+      <w:r>
+        <w:rPr>
+          <w:rtl w:val="0"/>
+        </w:rPr>
       </w:r>
     </w:p>
     <w:p>
@@ -712,28 +772,125 @@
     </w:p>
     <w:p>
       <w:pPr>
-        <w:spacing w:after="100" w:lineRule="auto"/>
+        <w:spacing w:after="80" w:lineRule="auto"/>
         <w:jc w:val="center"/>
         <w:rPr>
           <w:b w:val="1"/>
           <w:bCs w:val="1"/>
-        </w:rPr>
-      </w:pPr>
-      <w:r>
-        <w:rPr>
+          <w:i w:val="1"/>
+          <w:iCs w:val="1"/>
+        </w:rPr>
+      </w:pPr>
+      <w:r>
+        <w:rPr>
+          <w:b w:val="1"/>
+          <w:bCs w:val="1"/>
+          <w:i w:val="1"/>
+          <w:iCs w:val="1"/>
+          <w:rtl w:val="0"/>
+        </w:rPr>
+        <w:t xml:space="preserve"> </w:t>
+      </w:r>
+      <w:r>
+        <w:rPr>
+          <w:b w:val="1"/>
+          <w:bCs w:val="1"/>
           <w:i w:val="1"/>
           <w:iCs w:val="1"/>
         </w:rPr>
         <w:drawing>
           <wp:inline distB="114300" distT="114300" distL="114300" distR="114300">
-            <wp:extent cx="3805238" cy="2726521"/>
+            <wp:extent cx="2399952" cy="1828049"/>
             <wp:effectExtent b="0" l="0" r="0" t="0"/>
-            <wp:docPr id="1" name="image4.png"/>
+            <wp:docPr id="8" name="image2.png"/>
             <a:graphic>
               <a:graphicData uri="http://schemas.openxmlformats.org/drawingml/2006/picture">
                 <pic:pic>
                   <pic:nvPicPr>
-                    <pic:cNvPr id="0" name="image4.png"/>
+                    <pic:cNvPr id="0" name="image2.png"/>
+                    <pic:cNvPicPr preferRelativeResize="0"/>
+                  </pic:nvPicPr>
+                  <pic:blipFill>
+                    <a:blip r:embed="rId7"/>
+                    <a:srcRect b="0" l="0" r="0" t="0"/>
+                    <a:stretch>
+                      <a:fillRect/>
+                    </a:stretch>
+                  </pic:blipFill>
+                  <pic:spPr>
+                    <a:xfrm>
+                      <a:off x="0" y="0"/>
+                      <a:ext cx="2399952" cy="1828049"/>
+                    </a:xfrm>
+                    <a:prstGeom prst="rect"/>
+                    <a:ln/>
+                  </pic:spPr>
+                </pic:pic>
+              </a:graphicData>
+            </a:graphic>
+          </wp:inline>
+        </w:drawing>
+      </w:r>
+      <w:r>
+        <w:rPr>
+          <w:rtl w:val="0"/>
+        </w:rPr>
+      </w:r>
+    </w:p>
+    <w:p>
+      <w:pPr>
+        <w:rPr>
+          <w:b w:val="1"/>
+          <w:bCs w:val="1"/>
+        </w:rPr>
+      </w:pPr>
+      <w:r>
+        <w:rPr>
+          <w:b w:val="1"/>
+          <w:bCs w:val="1"/>
+          <w:rtl w:val="0"/>
+        </w:rPr>
+        <w:t xml:space="preserve">1 KB Frames — Page Faults (1.5 pts)</w:t>
+      </w:r>
+    </w:p>
+    <w:p>
+      <w:pPr>
+        <w:spacing w:after="80" w:lineRule="auto"/>
+        <w:jc w:val="center"/>
+        <w:rPr>
+          <w:b w:val="1"/>
+          <w:bCs w:val="1"/>
+          <w:i w:val="1"/>
+          <w:iCs w:val="1"/>
+        </w:rPr>
+      </w:pPr>
+      <w:r>
+        <w:rPr>
+          <w:b w:val="1"/>
+          <w:bCs w:val="1"/>
+          <w:i w:val="1"/>
+          <w:iCs w:val="1"/>
+          <w:rtl w:val="0"/>
+        </w:rPr>
+        <w:t xml:space="preserve"> </w:t>
+      </w:r>
+      <w:r>
+        <w:rPr>
+          <w:b w:val="1"/>
+          <w:bCs w:val="1"/>
+          <w:i w:val="1"/>
+          <w:iCs w:val="1"/>
+        </w:rPr>
+        <w:drawing>
+          <wp:inline distB="114300" distT="114300" distL="114300" distR="114300">
+            <wp:extent cx="2390427" cy="1780318"/>
+            <wp:effectExtent b="0" l="0" r="0" t="0"/>
+            <wp:docPr id="7" name="image3.png"/>
+            <a:graphic>
+              <a:graphicData uri="http://schemas.openxmlformats.org/drawingml/2006/picture">
+                <pic:pic>
+                  <pic:nvPicPr>
+                    <pic:cNvPr id="0" name="image3.png"/>
                     <pic:cNvPicPr preferRelativeResize="0"/>
                   </pic:nvPicPr>
                   <pic:blipFill>
@@ -746,7 +903,7 @@
                   <pic:spPr>
                     <a:xfrm>
                       <a:off x="0" y="0"/>
-                      <a:ext cx="3805238" cy="2726521"/>
+                      <a:ext cx="2390427" cy="1780318"/>
                     </a:xfrm>
                     <a:prstGeom prst="rect"/>
                     <a:ln/>
@@ -776,33 +933,47 @@
           <w:bCs w:val="1"/>
           <w:rtl w:val="0"/>
         </w:rPr>
-        <w:t xml:space="preserve">1 KB Frames — Page Faults (1.5 pts)</w:t>
-      </w:r>
-    </w:p>
-    <w:p>
-      <w:pPr>
-        <w:spacing w:after="100" w:lineRule="auto"/>
+        <w:t xml:space="preserve">2 KB Frames — Page Faults (1.5 pts)</w:t>
+      </w:r>
+    </w:p>
+    <w:p>
+      <w:pPr>
+        <w:spacing w:after="80" w:lineRule="auto"/>
         <w:jc w:val="center"/>
         <w:rPr>
           <w:b w:val="1"/>
           <w:bCs w:val="1"/>
-        </w:rPr>
-      </w:pPr>
-      <w:r>
-        <w:rPr>
+          <w:i w:val="1"/>
+          <w:iCs w:val="1"/>
+        </w:rPr>
+      </w:pPr>
+      <w:r>
+        <w:rPr>
+          <w:b w:val="1"/>
+          <w:bCs w:val="1"/>
+          <w:i w:val="1"/>
+          <w:iCs w:val="1"/>
+          <w:rtl w:val="0"/>
+        </w:rPr>
+        <w:t xml:space="preserve"> </w:t>
+      </w:r>
+      <w:r>
+        <w:rPr>
+          <w:b w:val="1"/>
+          <w:bCs w:val="1"/>
           <w:i w:val="1"/>
           <w:iCs w:val="1"/>
         </w:rPr>
         <w:drawing>
           <wp:inline distB="114300" distT="114300" distL="114300" distR="114300">
-            <wp:extent cx="2957513" cy="2213395"/>
+            <wp:extent cx="2380902" cy="1832144"/>
             <wp:effectExtent b="0" l="0" r="0" t="0"/>
-            <wp:docPr id="7" name="image2.png"/>
+            <wp:docPr id="5" name="image4.png"/>
             <a:graphic>
               <a:graphicData uri="http://schemas.openxmlformats.org/drawingml/2006/picture">
                 <pic:pic>
                   <pic:nvPicPr>
-                    <pic:cNvPr id="0" name="image2.png"/>
+                    <pic:cNvPr id="0" name="image4.png"/>
                     <pic:cNvPicPr preferRelativeResize="0"/>
                   </pic:nvPicPr>
                   <pic:blipFill>
@@ -815,7 +986,7 @@
                   <pic:spPr>
                     <a:xfrm>
                       <a:off x="0" y="0"/>
-                      <a:ext cx="2957513" cy="2213395"/>
+                      <a:ext cx="2380902" cy="1832144"/>
                     </a:xfrm>
                     <a:prstGeom prst="rect"/>
                     <a:ln/>
@@ -845,33 +1016,47 @@
           <w:bCs w:val="1"/>
           <w:rtl w:val="0"/>
         </w:rPr>
-        <w:t xml:space="preserve">2 KB Frames — Page Faults (1.5 pts)</w:t>
-      </w:r>
-    </w:p>
-    <w:p>
-      <w:pPr>
-        <w:spacing w:after="100" w:lineRule="auto"/>
+        <w:t xml:space="preserve">4 KB Frames — Page Faults (1.5 pts)</w:t>
+      </w:r>
+    </w:p>
+    <w:p>
+      <w:pPr>
+        <w:spacing w:after="80" w:lineRule="auto"/>
         <w:jc w:val="center"/>
         <w:rPr>
           <w:b w:val="1"/>
           <w:bCs w:val="1"/>
-        </w:rPr>
-      </w:pPr>
-      <w:r>
-        <w:rPr>
+          <w:i w:val="1"/>
+          <w:iCs w:val="1"/>
+        </w:rPr>
+      </w:pPr>
+      <w:r>
+        <w:rPr>
+          <w:b w:val="1"/>
+          <w:bCs w:val="1"/>
+          <w:i w:val="1"/>
+          <w:iCs w:val="1"/>
+          <w:rtl w:val="0"/>
+        </w:rPr>
+        <w:t xml:space="preserve"> </w:t>
+      </w:r>
+      <w:r>
+        <w:rPr>
+          <w:b w:val="1"/>
+          <w:bCs w:val="1"/>
           <w:i w:val="1"/>
           <w:iCs w:val="1"/>
         </w:rPr>
         <w:drawing>
           <wp:inline distB="114300" distT="114300" distL="114300" distR="114300">
-            <wp:extent cx="2938463" cy="2330992"/>
+            <wp:extent cx="2161827" cy="1712886"/>
             <wp:effectExtent b="0" l="0" r="0" t="0"/>
-            <wp:docPr id="5" name="image8.png"/>
+            <wp:docPr id="1" name="image6.png"/>
             <a:graphic>
               <a:graphicData uri="http://schemas.openxmlformats.org/drawingml/2006/picture">
                 <pic:pic>
                   <pic:nvPicPr>
-                    <pic:cNvPr id="0" name="image8.png"/>
+                    <pic:cNvPr id="0" name="image6.png"/>
                     <pic:cNvPicPr preferRelativeResize="0"/>
                   </pic:nvPicPr>
                   <pic:blipFill>
@@ -884,7 +1069,7 @@
                   <pic:spPr>
                     <a:xfrm>
                       <a:off x="0" y="0"/>
-                      <a:ext cx="2938463" cy="2330992"/>
+                      <a:ext cx="2161827" cy="1712886"/>
                     </a:xfrm>
                     <a:prstGeom prst="rect"/>
                     <a:ln/>
@@ -914,33 +1099,76 @@
           <w:bCs w:val="1"/>
           <w:rtl w:val="0"/>
         </w:rPr>
-        <w:t xml:space="preserve">4 KB Frames — Page Faults (1.5 pts)</w:t>
-      </w:r>
-    </w:p>
-    <w:p>
-      <w:pPr>
-        <w:spacing w:after="100" w:lineRule="auto"/>
+        <w:t xml:space="preserve">4. Frames vs. Page-Fault Rate — 4 charts (6 pts)</w:t>
+      </w:r>
+    </w:p>
+    <w:p>
+      <w:pPr>
+        <w:rPr>
+          <w:b w:val="1"/>
+          <w:bCs w:val="1"/>
+        </w:rPr>
+      </w:pPr>
+      <w:r>
+        <w:rPr>
+          <w:rtl w:val="0"/>
+        </w:rPr>
+      </w:r>
+    </w:p>
+    <w:p>
+      <w:pPr>
+        <w:rPr>
+          <w:b w:val="1"/>
+          <w:bCs w:val="1"/>
+        </w:rPr>
+      </w:pPr>
+      <w:r>
+        <w:rPr>
+          <w:b w:val="1"/>
+          <w:bCs w:val="1"/>
+          <w:rtl w:val="0"/>
+        </w:rPr>
+        <w:t xml:space="preserve">512 B Frames — Fault Rate (1.5 pts)</w:t>
+      </w:r>
+    </w:p>
+    <w:p>
+      <w:pPr>
+        <w:spacing w:after="80" w:lineRule="auto"/>
         <w:jc w:val="center"/>
         <w:rPr>
           <w:b w:val="1"/>
           <w:bCs w:val="1"/>
-        </w:rPr>
-      </w:pPr>
-      <w:r>
-        <w:rPr>
+          <w:i w:val="1"/>
+          <w:iCs w:val="1"/>
+        </w:rPr>
+      </w:pPr>
+      <w:r>
+        <w:rPr>
+          <w:b w:val="1"/>
+          <w:bCs w:val="1"/>
+          <w:i w:val="1"/>
+          <w:iCs w:val="1"/>
+          <w:rtl w:val="0"/>
+        </w:rPr>
+        <w:t xml:space="preserve"> </w:t>
+      </w:r>
+      <w:r>
+        <w:rPr>
+          <w:b w:val="1"/>
+          <w:bCs w:val="1"/>
           <w:i w:val="1"/>
           <w:iCs w:val="1"/>
         </w:rPr>
         <w:drawing>
           <wp:inline distB="114300" distT="114300" distL="114300" distR="114300">
-            <wp:extent cx="2652713" cy="2053302"/>
+            <wp:extent cx="1880840" cy="1312037"/>
             <wp:effectExtent b="0" l="0" r="0" t="0"/>
-            <wp:docPr id="2" name="image6.png"/>
+            <wp:docPr id="6" name="image8.png"/>
             <a:graphic>
               <a:graphicData uri="http://schemas.openxmlformats.org/drawingml/2006/picture">
                 <pic:pic>
                   <pic:nvPicPr>
-                    <pic:cNvPr id="0" name="image6.png"/>
+                    <pic:cNvPr id="0" name="image8.png"/>
                     <pic:cNvPicPr preferRelativeResize="0"/>
                   </pic:nvPicPr>
                   <pic:blipFill>
@@ -953,7 +1181,7 @@
                   <pic:spPr>
                     <a:xfrm>
                       <a:off x="0" y="0"/>
-                      <a:ext cx="2652713" cy="2053302"/>
+                      <a:ext cx="1880840" cy="1312037"/>
                     </a:xfrm>
                     <a:prstGeom prst="rect"/>
                     <a:ln/>
@@ -983,56 +1211,42 @@
           <w:bCs w:val="1"/>
           <w:rtl w:val="0"/>
         </w:rPr>
-        <w:t xml:space="preserve">4. Frames vs. Page-Fault Rate — 4 charts (6 pts)</w:t>
-      </w:r>
-    </w:p>
-    <w:p>
-      <w:pPr>
-        <w:spacing w:after="160" w:lineRule="auto"/>
-        <w:rPr/>
-      </w:pPr>
-      <w:r>
-        <w:rPr>
-          <w:rtl w:val="0"/>
-        </w:rPr>
-        <w:t xml:space="preserve">Insert one chart per frame size showing Frames (x-axis) vs. Page-Fault Rate (y-axis). Each chart must include a horizontal reference line at 10% fault rate, descriptive title, and labeled axes. (1.5 pts per chart)</w:t>
-      </w:r>
-    </w:p>
-    <w:p>
-      <w:pPr>
-        <w:rPr>
-          <w:b w:val="1"/>
-          <w:bCs w:val="1"/>
-        </w:rPr>
-      </w:pPr>
-      <w:r>
-        <w:rPr>
-          <w:b w:val="1"/>
-          <w:bCs w:val="1"/>
-          <w:rtl w:val="0"/>
-        </w:rPr>
-        <w:t xml:space="preserve">512 B Frames — Fault Rate (1.5 pts)</w:t>
-      </w:r>
-    </w:p>
-    <w:p>
-      <w:pPr>
-        <w:spacing w:after="100" w:lineRule="auto"/>
+        <w:t xml:space="preserve">1 KB Frames — Fault Rate (1.5 pts)</w:t>
+      </w:r>
+    </w:p>
+    <w:p>
+      <w:pPr>
+        <w:spacing w:after="80" w:lineRule="auto"/>
         <w:jc w:val="center"/>
         <w:rPr>
-          <w:i w:val="1"/>
-          <w:iCs w:val="1"/>
-        </w:rPr>
-      </w:pPr>
-      <w:r>
-        <w:rPr>
+          <w:b w:val="1"/>
+          <w:bCs w:val="1"/>
+          <w:i w:val="1"/>
+          <w:iCs w:val="1"/>
+        </w:rPr>
+      </w:pPr>
+      <w:r>
+        <w:rPr>
+          <w:b w:val="1"/>
+          <w:bCs w:val="1"/>
+          <w:i w:val="1"/>
+          <w:iCs w:val="1"/>
+          <w:rtl w:val="0"/>
+        </w:rPr>
+        <w:t xml:space="preserve"> </w:t>
+      </w:r>
+      <w:r>
+        <w:rPr>
+          <w:b w:val="1"/>
+          <w:bCs w:val="1"/>
           <w:i w:val="1"/>
           <w:iCs w:val="1"/>
         </w:rPr>
         <w:drawing>
           <wp:inline distB="114300" distT="114300" distL="114300" distR="114300">
-            <wp:extent cx="3671888" cy="2759800"/>
+            <wp:extent cx="2185988" cy="1685032"/>
             <wp:effectExtent b="0" l="0" r="0" t="0"/>
-            <wp:docPr id="8" name="image5.png"/>
+            <wp:docPr id="4" name="image5.png"/>
             <a:graphic>
               <a:graphicData uri="http://schemas.openxmlformats.org/drawingml/2006/picture">
                 <pic:pic>
@@ -1050,7 +1264,7 @@
                   <pic:spPr>
                     <a:xfrm>
                       <a:off x="0" y="0"/>
-                      <a:ext cx="3671888" cy="2759800"/>
+                      <a:ext cx="2185988" cy="1685032"/>
                     </a:xfrm>
                     <a:prstGeom prst="rect"/>
                     <a:ln/>
@@ -1080,33 +1294,32 @@
           <w:bCs w:val="1"/>
           <w:rtl w:val="0"/>
         </w:rPr>
-        <w:t xml:space="preserve">1 KB Frames — Fault Rate (1.5 pts)</w:t>
-      </w:r>
-    </w:p>
-    <w:p>
-      <w:pPr>
-        <w:spacing w:after="100" w:lineRule="auto"/>
+        <w:t xml:space="preserve">2 KB Frames — Fault Rate (1.5 pts)</w:t>
+      </w:r>
+    </w:p>
+    <w:p>
+      <w:pPr>
         <w:jc w:val="center"/>
         <w:rPr>
-          <w:i w:val="1"/>
-          <w:iCs w:val="1"/>
-        </w:rPr>
-      </w:pPr>
-      <w:r>
-        <w:rPr>
-          <w:i w:val="1"/>
-          <w:iCs w:val="1"/>
+          <w:b w:val="1"/>
+          <w:bCs w:val="1"/>
+        </w:rPr>
+      </w:pPr>
+      <w:r>
+        <w:rPr>
+          <w:b w:val="1"/>
+          <w:bCs w:val="1"/>
         </w:rPr>
         <w:drawing>
           <wp:inline distB="114300" distT="114300" distL="114300" distR="114300">
-            <wp:extent cx="2990850" cy="2309936"/>
+            <wp:extent cx="1990725" cy="1403298"/>
             <wp:effectExtent b="0" l="0" r="0" t="0"/>
-            <wp:docPr id="3" name="image3.png"/>
+            <wp:docPr id="3" name="image7.png"/>
             <a:graphic>
               <a:graphicData uri="http://schemas.openxmlformats.org/drawingml/2006/picture">
                 <pic:pic>
                   <pic:nvPicPr>
-                    <pic:cNvPr id="0" name="image3.png"/>
+                    <pic:cNvPr id="0" name="image7.png"/>
                     <pic:cNvPicPr preferRelativeResize="0"/>
                   </pic:nvPicPr>
                   <pic:blipFill>
@@ -1119,7 +1332,7 @@
                   <pic:spPr>
                     <a:xfrm>
                       <a:off x="0" y="0"/>
-                      <a:ext cx="2990850" cy="2309936"/>
+                      <a:ext cx="1990725" cy="1403298"/>
                     </a:xfrm>
                     <a:prstGeom prst="rect"/>
                     <a:ln/>
@@ -1138,44 +1351,79 @@
     </w:p>
     <w:p>
       <w:pPr>
-        <w:rPr>
-          <w:b w:val="1"/>
-          <w:bCs w:val="1"/>
-        </w:rPr>
-      </w:pPr>
-      <w:r>
-        <w:rPr>
-          <w:b w:val="1"/>
-          <w:bCs w:val="1"/>
-          <w:rtl w:val="0"/>
-        </w:rPr>
-        <w:t xml:space="preserve">2 KB Frames — Fault Rate (1.5 pts)</w:t>
-      </w:r>
-    </w:p>
-    <w:p>
-      <w:pPr>
-        <w:spacing w:after="100" w:lineRule="auto"/>
+        <w:spacing w:after="80" w:lineRule="auto"/>
+        <w:rPr>
+          <w:b w:val="1"/>
+          <w:bCs w:val="1"/>
+          <w:i w:val="1"/>
+          <w:iCs w:val="1"/>
+        </w:rPr>
+      </w:pPr>
+      <w:r>
+        <w:rPr>
+          <w:b w:val="1"/>
+          <w:bCs w:val="1"/>
+          <w:i w:val="1"/>
+          <w:iCs w:val="1"/>
+          <w:rtl w:val="0"/>
+        </w:rPr>
+        <w:t xml:space="preserve"> </w:t>
+      </w:r>
+    </w:p>
+    <w:p>
+      <w:pPr>
+        <w:rPr>
+          <w:b w:val="1"/>
+          <w:bCs w:val="1"/>
+        </w:rPr>
+      </w:pPr>
+      <w:r>
+        <w:rPr>
+          <w:b w:val="1"/>
+          <w:bCs w:val="1"/>
+          <w:rtl w:val="0"/>
+        </w:rPr>
+        <w:t xml:space="preserve">4 KB Frames — Fault Rate (1.5 pts)</w:t>
+      </w:r>
+    </w:p>
+    <w:p>
+      <w:pPr>
+        <w:spacing w:after="80" w:lineRule="auto"/>
         <w:jc w:val="center"/>
         <w:rPr>
-          <w:i w:val="1"/>
-          <w:iCs w:val="1"/>
-        </w:rPr>
-      </w:pPr>
-      <w:r>
-        <w:rPr>
+          <w:b w:val="1"/>
+          <w:bCs w:val="1"/>
+          <w:i w:val="1"/>
+          <w:iCs w:val="1"/>
+        </w:rPr>
+      </w:pPr>
+      <w:r>
+        <w:rPr>
+          <w:b w:val="1"/>
+          <w:bCs w:val="1"/>
+          <w:i w:val="1"/>
+          <w:iCs w:val="1"/>
+          <w:rtl w:val="0"/>
+        </w:rPr>
+        <w:t xml:space="preserve"> </w:t>
+      </w:r>
+      <w:r>
+        <w:rPr>
+          <w:b w:val="1"/>
+          <w:bCs w:val="1"/>
           <w:i w:val="1"/>
           <w:iCs w:val="1"/>
         </w:rPr>
         <w:drawing>
           <wp:inline distB="114300" distT="114300" distL="114300" distR="114300">
-            <wp:extent cx="3262313" cy="2570307"/>
+            <wp:extent cx="2214563" cy="1714157"/>
             <wp:effectExtent b="0" l="0" r="0" t="0"/>
-            <wp:docPr id="6" name="image7.png"/>
+            <wp:docPr id="2" name="image1.png"/>
             <a:graphic>
               <a:graphicData uri="http://schemas.openxmlformats.org/drawingml/2006/picture">
                 <pic:pic>
                   <pic:nvPicPr>
-                    <pic:cNvPr id="0" name="image7.png"/>
+                    <pic:cNvPr id="0" name="image1.png"/>
                     <pic:cNvPicPr preferRelativeResize="0"/>
                   </pic:nvPicPr>
                   <pic:blipFill>
@@ -1188,7 +1436,7 @@
                   <pic:spPr>
                     <a:xfrm>
                       <a:off x="0" y="0"/>
-                      <a:ext cx="3262313" cy="2570307"/>
+                      <a:ext cx="2214563" cy="1714157"/>
                     </a:xfrm>
                     <a:prstGeom prst="rect"/>
                     <a:ln/>
@@ -1218,131 +1466,90 @@
           <w:bCs w:val="1"/>
           <w:rtl w:val="0"/>
         </w:rPr>
-        <w:t xml:space="preserve">4 KB Frames — Fault Rate (1.5 pts)</w:t>
-      </w:r>
-    </w:p>
-    <w:p>
-      <w:pPr>
-        <w:spacing w:after="100" w:lineRule="auto"/>
-        <w:jc w:val="center"/>
-        <w:rPr>
-          <w:i w:val="1"/>
-          <w:iCs w:val="1"/>
-        </w:rPr>
-      </w:pPr>
-      <w:r>
-        <w:rPr>
-          <w:i w:val="1"/>
-          <w:iCs w:val="1"/>
-        </w:rPr>
-        <w:drawing>
-          <wp:inline distB="114300" distT="114300" distL="114300" distR="114300">
-            <wp:extent cx="3433763" cy="2624847"/>
-            <wp:effectExtent b="0" l="0" r="0" t="0"/>
-            <wp:docPr id="4" name="image1.png"/>
-            <a:graphic>
-              <a:graphicData uri="http://schemas.openxmlformats.org/drawingml/2006/picture">
-                <pic:pic>
-                  <pic:nvPicPr>
-                    <pic:cNvPr id="0" name="image1.png"/>
-                    <pic:cNvPicPr preferRelativeResize="0"/>
-                  </pic:nvPicPr>
-                  <pic:blipFill>
-                    <a:blip r:embed="rId15"/>
-                    <a:srcRect b="0" l="0" r="0" t="0"/>
-                    <a:stretch>
-                      <a:fillRect/>
-                    </a:stretch>
-                  </pic:blipFill>
-                  <pic:spPr>
-                    <a:xfrm>
-                      <a:off x="0" y="0"/>
-                      <a:ext cx="3433763" cy="2624847"/>
-                    </a:xfrm>
-                    <a:prstGeom prst="rect"/>
-                    <a:ln/>
-                  </pic:spPr>
-                </pic:pic>
-              </a:graphicData>
-            </a:graphic>
-          </wp:inline>
-        </w:drawing>
-      </w:r>
-      <w:r>
-        <w:rPr>
-          <w:rtl w:val="0"/>
-        </w:rPr>
-      </w:r>
-    </w:p>
-    <w:p>
-      <w:pPr>
-        <w:rPr>
-          <w:b w:val="1"/>
-          <w:bCs w:val="1"/>
-        </w:rPr>
-      </w:pPr>
-      <w:r>
-        <w:rPr>
-          <w:b w:val="1"/>
-          <w:bCs w:val="1"/>
-          <w:rtl w:val="0"/>
-        </w:rPr>
         <w:t xml:space="preserve">5. Curve Shape and Working Set Analysis (5 pts)</w:t>
       </w:r>
     </w:p>
     <w:p>
       <w:pPr>
-        <w:spacing w:after="360" w:lineRule="auto"/>
+        <w:spacing w:after="280" w:lineRule="auto"/>
+        <w:rPr>
+          <w:b w:val="1"/>
+          <w:bCs w:val="1"/>
+        </w:rPr>
+      </w:pPr>
+      <w:r>
+        <w:rPr>
+          <w:b w:val="1"/>
+          <w:bCs w:val="1"/>
+          <w:rtl w:val="0"/>
+        </w:rPr>
+        <w:t xml:space="preserve">The shape is asymptotic relative to the x-axis as it approaches infinite frames. The graphs start very high, miss-wise, then taper off. Beyond the inflection point, frames start to decrease returns.</w:t>
+      </w:r>
+    </w:p>
+    <w:p>
+      <w:pPr>
+        <w:rPr>
+          <w:b w:val="1"/>
+          <w:bCs w:val="1"/>
+        </w:rPr>
+      </w:pPr>
+      <w:r>
+        <w:rPr>
+          <w:b w:val="1"/>
+          <w:bCs w:val="1"/>
+          <w:rtl w:val="0"/>
+        </w:rPr>
+        <w:t xml:space="preserve">6. Frame Size and Fault Rate Tradeoffs (5 pts)</w:t>
+      </w:r>
+    </w:p>
+    <w:p>
+      <w:pPr>
+        <w:spacing w:after="80" w:lineRule="auto"/>
+        <w:rPr>
+          <w:b w:val="1"/>
+          <w:bCs w:val="1"/>
+        </w:rPr>
+      </w:pPr>
+      <w:r>
+        <w:rPr>
+          <w:b w:val="1"/>
+          <w:bCs w:val="1"/>
+          <w:rtl w:val="0"/>
+        </w:rPr>
+        <w:t xml:space="preserve">Larger frames mean more address collisions, reducing the faults. With more memory allocation and utilization comes more efficient performance. </w:t>
+      </w:r>
+    </w:p>
+    <w:p>
+      <w:pPr>
+        <w:rPr>
+          <w:b w:val="1"/>
+          <w:bCs w:val="1"/>
+        </w:rPr>
+      </w:pPr>
+      <w:r>
+        <w:rPr>
+          <w:b w:val="1"/>
+          <w:bCs w:val="1"/>
+          <w:rtl w:val="0"/>
+        </w:rPr>
+        <w:br w:type="textWrapping"/>
+        <w:t xml:space="preserve"> Doc stmt: references are on site</w:t>
+      </w:r>
+    </w:p>
+    <w:p>
+      <w:pPr>
         <w:rPr/>
       </w:pPr>
       <w:r>
         <w:rPr>
           <w:rtl w:val="0"/>
         </w:rPr>
-        <w:t xml:space="preserve">The shape is asymptotic relative to the x-axis as it approaches infinite frames. The graphs start very high, miss-wise, then taper off. Beyond the inflection point, frames start to decrease returns.</w:t>
-      </w:r>
-    </w:p>
-    <w:p>
-      <w:pPr>
-        <w:rPr>
-          <w:b w:val="1"/>
-          <w:bCs w:val="1"/>
-        </w:rPr>
-      </w:pPr>
-      <w:r>
-        <w:rPr>
-          <w:b w:val="1"/>
-          <w:bCs w:val="1"/>
-          <w:rtl w:val="0"/>
-        </w:rPr>
-        <w:t xml:space="preserve">6. Frame Size and Fault Rate Tradeoffs (5 pts)</w:t>
-      </w:r>
-    </w:p>
-    <w:p>
-      <w:pPr>
-        <w:spacing w:after="100" w:lineRule="auto"/>
+      </w:r>
+    </w:p>
+    <w:p>
+      <w:pPr>
         <w:rPr/>
       </w:pPr>
-      <w:r>
-        <w:rPr>
-          <w:rtl w:val="0"/>
-        </w:rPr>
-        <w:t xml:space="preserve">Larger frames mean more address collisions, reducing the faults. With more memory allocation and utilization comes more efficient performance. </w:t>
-      </w:r>
-    </w:p>
-    <w:p>
-      <w:pPr>
-        <w:rPr/>
-      </w:pPr>
-      <w:r>
-        <w:rPr>
-          <w:b w:val="1"/>
-          <w:bCs w:val="1"/>
-          <w:rtl w:val="0"/>
-        </w:rPr>
-        <w:br w:type="textWrapping"/>
-        <w:t xml:space="preserve">Doc stmt: references are on site</w:t>
-      </w:r>
       <w:r>
         <w:rPr>
           <w:rtl w:val="0"/>

</xml_diff>